<commit_message>
Corregge l'abbinamento titoli-foto di E.B.Art e completa le cinque didascalie
Resilienza sono i fiori, Zen l'albero, Primavera d'autunno le spirali;
aggiunte Anemoni di mare e Primavera d'autunno.

Co-Authored-By: Claude Opus 5.5 <noreply@anthropic.com>
Claude-Session: https://claude.ai/code/session_0148bZgqQiCtdshijf84M1Qp
</commit_message>
<xml_diff>
--- a/testi-critici/artisti/eb-art-luoghi-dell-anima/word/opera-resilienza.docx
+++ b/testi-critici/artisti/eb-art-luoghi-dell-anima/word/opera-resilienza.docx
@@ -63,7 +63,7 @@
           <w:color w:val="1E1B18"/>
           <w:sz w:val="21"/>
         </w:rPr>
-        <w:t>Il vento ha piegato il tronco fino a terra, ma le radici tengono. Rami neri e nodosi si allungano contro un cielo che sfuma dal viola al turchese, e la carta stropicciata dà alla superficie la ruvidità della corteccia: resistere, qui, è un modo di fiorire.</w:t>
+        <w:t>Tre fiori si alzano su steli sottili, contornati da un segno scuro in rilievo che li regge come un’armatura. Uno si piega, gli altri tengono; intorno, cerchi e strisce scure come ferite. Fragili e tenaci insieme: resilienza è restare in fiore anche quando il vento gira.</w:t>
       </w:r>
     </w:p>
     <w:p>
@@ -79,7 +79,7 @@
           <w:color w:val="6B645B"/>
           <w:sz w:val="18"/>
         </w:rPr>
-        <w:t>The wind has bent the trunk to the ground, but the roots hold. Black, knotted branches reach out against a sky fading from violet to turquoise, and the crumpled paper gives the surface the roughness of bark: here, to resist is a way of blossoming.</w:t>
+        <w:t>Three flowers rise on slender stems, outlined by a dark raised line that holds them up like armour. One bends, the others stand; around them, circles and dark strips like wounds. Fragile and tenacious at once: resilience is staying in bloom even when the wind turns.</w:t>
       </w:r>
     </w:p>
     <w:sectPr>

</xml_diff>